<commit_message>
Add HKFEI article (2026-9-10); update Bunz paper for resubmission
HKFEI: 建立AI學習數據治理制度 可由一紙合約開始 (明報, 2026-9-10,
與何杏研和趙藝婷). PDF generated locally. The English version carries no
AI-translation disclaimer but was skipped, consistent with 2026-8-27.

Bunz paper, revised for resubmission to the Economic Journal:
  - retitled "Promise and Perils of Redeemable Money: Evidence from a
    Barter Platform"; new abstract; Last Updated September 2026
  - Bunz.pdf replaced with the September 2026 draft; new online appendix
    added as Bunz_appendix.pdf
  - moved to the top of Working Papers (newest), on the site and the CV

CV: new Chinese article added; Bunz title and position updated.

Co-Authored-By: Claude Opus 5 (1M context) <noreply@anthropic.com>
</commit_message>
<xml_diff>
--- a/static/CV.docx
+++ b/static/CV.docx
@@ -1651,7 +1651,49 @@
         <w:rPr>
           <w:rFonts w:ascii="Times" w:hAnsi="Times"/>
         </w:rPr>
-        <w:t xml:space="preserve">“Domestic Outsourcing and Young-worker Entry into the Formal Sector” (with Mayara Felix)</w:t>
+        <w:t>“</w:t>
+      </w:r>
+      <w:r>
+        <w:rPr>
+          <w:rFonts w:ascii="Times" w:hAnsi="Times"/>
+        </w:rPr>
+        <w:t>Promise and Perils of Redeemable Money: Evidence from a Barter Platform</w:t>
+      </w:r>
+      <w:r>
+        <w:rPr>
+          <w:rFonts w:ascii="Times" w:hAnsi="Times"/>
+        </w:rPr>
+        <w:t>”</w:t>
+      </w:r>
+      <w:r>
+        <w:rPr>
+          <w:rFonts w:ascii="Times" w:hAnsi="Times"/>
+        </w:rPr>
+        <w:t xml:space="preserve"> </w:t>
+      </w:r>
+      <w:r>
+        <w:rPr>
+          <w:rFonts w:ascii="Times" w:hAnsi="Times"/>
+          <w:i/>
+          <w:iCs/>
+        </w:rPr>
+        <w:t xml:space="preserve">Revise and Resubmit, </w:t>
+      </w:r>
+      <w:r>
+        <w:rPr>
+          <w:rFonts w:ascii="Times" w:hAnsi="Times"/>
+          <w:i/>
+          <w:iCs/>
+        </w:rPr>
+        <w:t xml:space="preserve">Economic </w:t>
+      </w:r>
+      <w:r>
+        <w:rPr>
+          <w:rFonts w:ascii="Times" w:hAnsi="Times"/>
+          <w:i/>
+          <w:iCs/>
+        </w:rPr>
+        <w:t>Journal</w:t>
       </w:r>
     </w:p>
     <w:p>
@@ -1671,7 +1713,7 @@
         <w:rPr>
           <w:rFonts w:ascii="Times" w:hAnsi="Times"/>
         </w:rPr>
-        <w:t xml:space="preserve">“The Displacement Effects of Domestic Outsourcing” (with Mayara Felix)</w:t>
+        <w:t xml:space="preserve">“Domestic Outsourcing and Young-worker Entry into the Formal Sector” (with Mayara Felix)</w:t>
       </w:r>
     </w:p>
     <w:p>
@@ -1691,49 +1733,7 @@
         <w:rPr>
           <w:rFonts w:ascii="Times" w:hAnsi="Times"/>
         </w:rPr>
-        <w:t>“</w:t>
-      </w:r>
-      <w:r>
-        <w:rPr>
-          <w:rFonts w:ascii="Times" w:hAnsi="Times"/>
-        </w:rPr>
-        <w:t>The Promise and Perils of Platform Money: Evidence from a Barter Community</w:t>
-      </w:r>
-      <w:r>
-        <w:rPr>
-          <w:rFonts w:ascii="Times" w:hAnsi="Times"/>
-        </w:rPr>
-        <w:t>”</w:t>
-      </w:r>
-      <w:r>
-        <w:rPr>
-          <w:rFonts w:ascii="Times" w:hAnsi="Times"/>
-        </w:rPr>
-        <w:t xml:space="preserve"> </w:t>
-      </w:r>
-      <w:r>
-        <w:rPr>
-          <w:rFonts w:ascii="Times" w:hAnsi="Times"/>
-          <w:i/>
-          <w:iCs/>
-        </w:rPr>
-        <w:t xml:space="preserve">Revise and Resubmit, </w:t>
-      </w:r>
-      <w:r>
-        <w:rPr>
-          <w:rFonts w:ascii="Times" w:hAnsi="Times"/>
-          <w:i/>
-          <w:iCs/>
-        </w:rPr>
-        <w:t xml:space="preserve">Economic </w:t>
-      </w:r>
-      <w:r>
-        <w:rPr>
-          <w:rFonts w:ascii="Times" w:hAnsi="Times"/>
-          <w:i/>
-          <w:iCs/>
-        </w:rPr>
-        <w:t>Journal</w:t>
+        <w:t xml:space="preserve">“The Displacement Effects of Domestic Outsourcing” (with Mayara Felix)</w:t>
       </w:r>
     </w:p>
     <w:p>
@@ -2425,6 +2425,27 @@
           <w:bCs/>
         </w:rPr>
         <w:t>CHINESE)</w:t>
+      </w:r>
+    </w:p>
+    <w:p>
+      <w:pPr>
+        <w:pStyle w:val="ListParagraph"/>
+        <w:numPr>
+          <w:ilvl w:val="0"/>
+          <w:numId w:val="1"/>
+        </w:numPr>
+        <w:spacing w:after="120" w:line="360" w:lineRule="auto"/>
+        <w:rPr>
+          <w:rFonts w:ascii="Times" w:hAnsi="Times"/>
+          <w:lang w:eastAsia="zh-TW"/>
+        </w:rPr>
+      </w:pPr>
+      <w:r>
+        <w:rPr>
+          <w:rFonts w:ascii="Times" w:hAnsi="Times" w:hint="eastAsia"/>
+          <w:lang w:eastAsia="zh-TW"/>
+        </w:rPr>
+        <w:t xml:space="preserve">建立AI學習數據治理制度 可由一紙合約開始 (明報, 2026-9-10, 與何杏研和趙藝婷)</w:t>
       </w:r>
     </w:p>
     <w:p>

</xml_diff>

<commit_message>
Add HKFEI articles: 居屋加大 and 香港論文密度
</commit_message>
<xml_diff>
--- a/static/CV.docx
+++ b/static/CV.docx
@@ -2445,7 +2445,7 @@
           <w:rFonts w:ascii="Times" w:hAnsi="Times" w:hint="eastAsia"/>
           <w:lang w:eastAsia="zh-TW"/>
         </w:rPr>
-        <w:t xml:space="preserve">建立AI學習數據治理制度 可由一紙合約開始 (明報, 2026-9-10, 與何杏研和趙藝婷)</w:t>
+        <w:t xml:space="preserve">香港論文密度世界第4 科技產出為何只排第30 (明報, 2026-10-8, 與郭國全和牛致行)</w:t>
       </w:r>
     </w:p>
     <w:p>
@@ -2466,7 +2466,7 @@
           <w:rFonts w:ascii="Times" w:hAnsi="Times" w:hint="eastAsia"/>
           <w:lang w:eastAsia="zh-TW"/>
         </w:rPr>
-        <w:t xml:space="preserve">AI已入校，為何因材施教仍差一步？ (明報, 2026-8-27, 與何杏研和趙藝婷)</w:t>
+        <w:t xml:space="preserve">居屋加大是重要一步 青年要的是養得起家的家 (明報, 2026-9-24, 與牛致行)</w:t>
       </w:r>
     </w:p>
     <w:p>
@@ -2487,7 +2487,7 @@
           <w:rFonts w:ascii="Times" w:hAnsi="Times" w:hint="eastAsia"/>
           <w:lang w:eastAsia="zh-TW"/>
         </w:rPr>
-        <w:t xml:space="preserve">AI教育的真正願景：因材施教不再是奢望 (明報, 2026-8-20, 與何杏研和趙藝婷)</w:t>
+        <w:t xml:space="preserve">建立AI學習數據治理制度 可由一紙合約開始 (明報, 2026-9-10, 與何杏研和趙藝婷)</w:t>
       </w:r>
     </w:p>
     <w:p>
@@ -2508,7 +2508,7 @@
           <w:rFonts w:ascii="Times" w:hAnsi="Times" w:hint="eastAsia"/>
           <w:lang w:eastAsia="zh-TW"/>
         </w:rPr>
-        <w:t xml:space="preserve">香港中小學 AI 應用與數據治理 (未來經濟學院研究報告, 2026-8-3, 與何杏研和趙藝婷)</w:t>
+        <w:t xml:space="preserve">AI已入校，為何因材施教仍差一步？ (明報, 2026-8-27, 與何杏研和趙藝婷)</w:t>
       </w:r>
     </w:p>
     <w:p>
@@ -2529,7 +2529,7 @@
           <w:rFonts w:ascii="Times" w:hAnsi="Times" w:hint="eastAsia"/>
           <w:lang w:eastAsia="zh-TW"/>
         </w:rPr>
-        <w:t xml:space="preserve">AI時代，孩子該學甚麼？ (明報, 2026-7-30, 與何杏研和趙藝婷)</w:t>
+        <w:t xml:space="preserve">AI教育的真正願景：因材施教不再是奢望 (明報, 2026-8-20, 與何杏研和趙藝婷)</w:t>
       </w:r>
     </w:p>
     <w:p>
@@ -2550,7 +2550,7 @@
           <w:rFonts w:ascii="Times" w:hAnsi="Times" w:hint="eastAsia"/>
           <w:lang w:eastAsia="zh-TW"/>
         </w:rPr>
-        <w:t xml:space="preserve">從「磚頭」到成家：北部都會區需要一套讓青年扎根的政策 (明報, 2026-7-16, 與牛致行)</w:t>
+        <w:t xml:space="preserve">香港中小學 AI 應用與數據治理 (未來經濟學院研究報告, 2026-8-3, 與何杏研和趙藝婷)</w:t>
       </w:r>
     </w:p>
     <w:p>
@@ -2571,7 +2571,7 @@
           <w:rFonts w:ascii="Times" w:hAnsi="Times" w:hint="eastAsia"/>
           <w:lang w:eastAsia="zh-TW"/>
         </w:rPr>
-        <w:t xml:space="preserve">北部都會區留住人才：四大政策方案，讓青年住戶扎根香港經濟新引擎 (未來經濟學院研究報告, 2026-7-12, 與牛致行)</w:t>
+        <w:t xml:space="preserve">AI時代，孩子該學甚麼？ (明報, 2026-7-30, 與何杏研和趙藝婷)</w:t>
       </w:r>
     </w:p>
     <w:p>
@@ -2592,7 +2592,7 @@
           <w:rFonts w:ascii="Times" w:hAnsi="Times" w:hint="eastAsia"/>
           <w:lang w:eastAsia="zh-TW"/>
         </w:rPr>
-        <w:t xml:space="preserve">「精準」扶貧，香港需要數據基建 (明報, 2026-7-2, 與蔡欣庭)</w:t>
+        <w:t xml:space="preserve">從「磚頭」到成家：北部都會區需要一套讓青年扎根的政策 (明報, 2026-7-16, 與牛致行)</w:t>
       </w:r>
     </w:p>
     <w:p>
@@ -2613,7 +2613,7 @@
           <w:rFonts w:ascii="Times" w:hAnsi="Times" w:hint="eastAsia"/>
           <w:lang w:eastAsia="zh-TW"/>
         </w:rPr>
-        <w:t xml:space="preserve">香港新建的房子，能容人嗎？ (明報, 2026-6-25)</w:t>
+        <w:t xml:space="preserve">北部都會區留住人才：四大政策方案，讓青年住戶扎根香港經濟新引擎 (未來經濟學院研究報告, 2026-7-12, 與牛致行)</w:t>
       </w:r>
     </w:p>
     <w:p>
@@ -2634,7 +2634,7 @@
           <w:rFonts w:ascii="Times" w:hAnsi="Times" w:hint="eastAsia"/>
           <w:lang w:eastAsia="zh-TW"/>
         </w:rPr>
-        <w:t xml:space="preserve">房委會兩策 讓單位流向最合適住戶 (信報, 2026-6-24, 與牛致行)</w:t>
+        <w:t xml:space="preserve">「精準」扶貧，香港需要數據基建 (明報, 2026-7-2, 與蔡欣庭)</w:t>
       </w:r>
     </w:p>
     <w:p>
@@ -2655,7 +2655,7 @@
           <w:rFonts w:ascii="Times" w:hAnsi="Times" w:hint="eastAsia"/>
           <w:lang w:eastAsia="zh-TW"/>
         </w:rPr>
-        <w:t xml:space="preserve">愈建愈小：1995–2024 年香港新落成住宅單位面積變化 (未來經濟學院研究報告, 2026-6-23, 與歐煜陽和牛致行)</w:t>
+        <w:t xml:space="preserve">香港新建的房子，能容人嗎？ (明報, 2026-6-25)</w:t>
       </w:r>
     </w:p>
     <w:p>
@@ -2676,7 +2676,7 @@
           <w:rFonts w:ascii="Times" w:hAnsi="Times" w:hint="eastAsia"/>
           <w:lang w:eastAsia="zh-TW"/>
         </w:rPr>
-        <w:t xml:space="preserve">不只是就業危機：AI正在切斷香港的人才培育管道 (明報, 2026-6-18, 與何杏研和趙藝婷)</w:t>
+        <w:t xml:space="preserve">房委會兩策 讓單位流向最合適住戶 (信報, 2026-6-24, 與牛致行)</w:t>
       </w:r>
     </w:p>
     <w:p>
@@ -2697,7 +2697,7 @@
           <w:rFonts w:ascii="Times" w:hAnsi="Times" w:hint="eastAsia"/>
           <w:lang w:eastAsia="zh-TW"/>
         </w:rPr>
-        <w:t xml:space="preserve">從殖民管治到對接國家規劃：香港需要建立政策研究生態 (明報, 2026-6-4, 與牛致行和宋恩榮)</w:t>
+        <w:t xml:space="preserve">愈建愈小：1995–2024 年香港新落成住宅單位面積變化 (未來經濟學院研究報告, 2026-6-23, 與歐煜陽和牛致行)</w:t>
       </w:r>
     </w:p>
     <w:p>
@@ -2718,7 +2718,7 @@
           <w:rFonts w:ascii="Times" w:hAnsi="Times" w:hint="eastAsia"/>
           <w:lang w:eastAsia="zh-TW"/>
         </w:rPr>
-        <w:t xml:space="preserve">規劃不是諮詢：香港首份五年規劃的真正考驗 (明報, 2026-5-28, 與牛致行和宋恩榮)</w:t>
+        <w:t xml:space="preserve">不只是就業危機：AI正在切斷香港的人才培育管道 (明報, 2026-6-18, 與何杏研和趙藝婷)</w:t>
       </w:r>
     </w:p>
     <w:p>
@@ -2739,7 +2739,7 @@
           <w:rFonts w:ascii="Times" w:hAnsi="Times" w:hint="eastAsia"/>
           <w:lang w:eastAsia="zh-TW"/>
         </w:rPr>
-        <w:t xml:space="preserve">北都要做大灣區人才磁石：大學城倍增　洪水橋牛潭尾先行先試 (明報, 2026-5-12, 與牛致行和宋恩榮)</w:t>
+        <w:t xml:space="preserve">從殖民管治到對接國家規劃：香港需要建立政策研究生態 (明報, 2026-6-4, 與牛致行和宋恩榮)</w:t>
       </w:r>
     </w:p>
     <w:p>
@@ -2760,41 +2760,7 @@
           <w:rFonts w:ascii="Times" w:hAnsi="Times" w:hint="eastAsia"/>
           <w:lang w:eastAsia="zh-TW"/>
         </w:rPr>
-        <w:t>北都莫再走天水圍舊路——公營房屋必須由「租」轉「購」</w:t>
-      </w:r>
-      <w:r>
-        <w:rPr>
-          <w:rFonts w:ascii="Times" w:hAnsi="Times"/>
-        </w:rPr>
-        <w:t xml:space="preserve"> (</w:t>
-      </w:r>
-      <w:proofErr w:type="spellStart"/>
-      <w:r>
-        <w:rPr>
-          <w:rFonts w:ascii="Times" w:hAnsi="Times" w:hint="eastAsia"/>
-          <w:lang w:eastAsia="zh-TW"/>
-        </w:rPr>
-        <w:t>明報</w:t>
-      </w:r>
-      <w:proofErr w:type="spellEnd"/>
-      <w:r>
-        <w:rPr>
-          <w:rFonts w:ascii="Times" w:hAnsi="Times"/>
-        </w:rPr>
-        <w:t xml:space="preserve">, 2026-5-6, </w:t>
-      </w:r>
-      <w:r>
-        <w:rPr>
-          <w:rFonts w:ascii="Times" w:hAnsi="Times" w:hint="eastAsia"/>
-          <w:lang w:eastAsia="zh-TW"/>
-        </w:rPr>
-        <w:t>與牛致行和宋恩榮</w:t>
-      </w:r>
-      <w:r>
-        <w:rPr>
-          <w:rFonts w:ascii="Times" w:hAnsi="Times"/>
-        </w:rPr>
-        <w:t>)</w:t>
+        <w:t xml:space="preserve">規劃不是諮詢：香港首份五年規劃的真正考驗 (明報, 2026-5-28, 與牛致行和宋恩榮)</w:t>
       </w:r>
     </w:p>
     <w:p>
@@ -2806,61 +2772,16 @@
         </w:numPr>
         <w:spacing w:after="120" w:line="360" w:lineRule="auto"/>
         <w:rPr>
-          <w:rFonts w:ascii="Times" w:hAnsi="Times" w:hint="eastAsia"/>
-          <w:lang w:eastAsia="zh-TW"/>
-        </w:rPr>
-      </w:pPr>
-      <w:r>
-        <w:rPr>
-          <w:rFonts w:ascii="Times" w:hAnsi="Times" w:hint="eastAsia"/>
-          <w:lang w:eastAsia="zh-TW"/>
-        </w:rPr>
-        <w:t>從上流階梯到階梯斷層</w:t>
-      </w:r>
-      <w:r>
-        <w:rPr>
-          <w:rFonts w:ascii="Times" w:hAnsi="Times"/>
-        </w:rPr>
-        <w:t>——</w:t>
-      </w:r>
-      <w:r>
-        <w:rPr>
-          <w:rFonts w:ascii="Times" w:hAnsi="Times" w:hint="eastAsia"/>
-          <w:lang w:eastAsia="zh-TW"/>
-        </w:rPr>
-        <w:t>香港公營房屋福利的世代差距</w:t>
-      </w:r>
-      <w:r>
-        <w:rPr>
-          <w:rFonts w:ascii="Times" w:hAnsi="Times"/>
-        </w:rPr>
-        <w:t xml:space="preserve"> (</w:t>
-      </w:r>
-      <w:r>
-        <w:rPr>
-          <w:rFonts w:ascii="Times" w:hAnsi="Times" w:hint="eastAsia"/>
-          <w:lang w:eastAsia="zh-TW"/>
-        </w:rPr>
-        <w:t>明報</w:t>
-      </w:r>
-      <w:r>
-        <w:rPr>
-          <w:rFonts w:ascii="Times" w:hAnsi="Times"/>
-        </w:rPr>
-        <w:t xml:space="preserve">, 2026-1-29, </w:t>
-      </w:r>
-      <w:r>
-        <w:rPr>
-          <w:rFonts w:ascii="Times" w:hAnsi="Times" w:hint="eastAsia"/>
-          <w:lang w:eastAsia="zh-TW"/>
-        </w:rPr>
-        <w:t>與牛致行和宋恩榮</w:t>
-      </w:r>
-      <w:r>
-        <w:rPr>
-          <w:rFonts w:ascii="Times" w:hAnsi="Times"/>
-        </w:rPr>
-        <w:t>)</w:t>
+          <w:rFonts w:ascii="Times" w:hAnsi="Times"/>
+          <w:lang w:eastAsia="zh-TW"/>
+        </w:rPr>
+      </w:pPr>
+      <w:r>
+        <w:rPr>
+          <w:rFonts w:ascii="Times" w:hAnsi="Times" w:hint="eastAsia"/>
+          <w:lang w:eastAsia="zh-TW"/>
+        </w:rPr>
+        <w:t xml:space="preserve">北都要做大灣區人才磁石：大學城倍增　洪水橋牛潭尾先行先試 (明報, 2026-5-12, 與牛致行和宋恩榮)</w:t>
       </w:r>
     </w:p>
     <w:p>
@@ -2872,29 +2793,16 @@
         </w:numPr>
         <w:spacing w:after="120" w:line="360" w:lineRule="auto"/>
         <w:rPr>
-          <w:rFonts w:ascii="Times" w:hAnsi="Times" w:hint="eastAsia"/>
-          <w:lang w:eastAsia="zh-TW"/>
-        </w:rPr>
-      </w:pPr>
-      <w:r>
-        <w:rPr>
-          <w:rFonts w:ascii="Times" w:hAnsi="Times" w:hint="eastAsia"/>
-          <w:lang w:eastAsia="zh-TW"/>
-        </w:rPr>
-        <w:t>闡釋</w:t>
-      </w:r>
-      <w:r>
-        <w:rPr>
-          <w:rFonts w:ascii="Times" w:hAnsi="Times"/>
-        </w:rPr>
-        <w:t>1985-2023</w:t>
-      </w:r>
-      <w:r>
-        <w:rPr>
-          <w:rFonts w:ascii="Times" w:hAnsi="Times" w:hint="eastAsia"/>
-          <w:lang w:eastAsia="zh-TW"/>
-        </w:rPr>
-        <w:t>年間香港房屋負擔能力與置業動向</w:t>
+          <w:rFonts w:ascii="Times" w:hAnsi="Times"/>
+          <w:lang w:eastAsia="zh-TW"/>
+        </w:rPr>
+      </w:pPr>
+      <w:r>
+        <w:rPr>
+          <w:rFonts w:ascii="Times" w:hAnsi="Times" w:hint="eastAsia"/>
+          <w:lang w:eastAsia="zh-TW"/>
+        </w:rPr>
+        <w:t>北都莫再走天水圍舊路——公營房屋必須由「租」轉「購」</w:t>
       </w:r>
       <w:r>
         <w:rPr>
@@ -2902,25 +2810,27 @@
         </w:rPr>
         <w:t xml:space="preserve"> (</w:t>
       </w:r>
-      <w:r>
-        <w:rPr>
-          <w:rFonts w:ascii="Times" w:hAnsi="Times" w:hint="eastAsia"/>
-          <w:lang w:eastAsia="zh-TW"/>
-        </w:rPr>
-        <w:t>香港經濟政策綠皮書</w:t>
-      </w:r>
-      <w:r>
-        <w:rPr>
-          <w:rFonts w:ascii="Times" w:hAnsi="Times"/>
-        </w:rPr>
-        <w:t xml:space="preserve">, 2026-1-14, </w:t>
-      </w:r>
-      <w:r>
-        <w:rPr>
-          <w:rFonts w:ascii="Times" w:hAnsi="Times" w:hint="eastAsia"/>
-          <w:lang w:eastAsia="zh-TW"/>
-        </w:rPr>
-        <w:t>與黃唯一和牛致行</w:t>
+      <w:proofErr w:type="spellStart"/>
+      <w:r>
+        <w:rPr>
+          <w:rFonts w:ascii="Times" w:hAnsi="Times" w:hint="eastAsia"/>
+          <w:lang w:eastAsia="zh-TW"/>
+        </w:rPr>
+        <w:t>明報</w:t>
+      </w:r>
+      <w:proofErr w:type="spellEnd"/>
+      <w:r>
+        <w:rPr>
+          <w:rFonts w:ascii="Times" w:hAnsi="Times"/>
+        </w:rPr>
+        <w:t xml:space="preserve">, 2026-5-6, </w:t>
+      </w:r>
+      <w:r>
+        <w:rPr>
+          <w:rFonts w:ascii="Times" w:hAnsi="Times" w:hint="eastAsia"/>
+          <w:lang w:eastAsia="zh-TW"/>
+        </w:rPr>
+        <w:t>與牛致行和宋恩榮</w:t>
       </w:r>
       <w:r>
         <w:rPr>
@@ -2938,29 +2848,29 @@
         </w:numPr>
         <w:spacing w:after="120" w:line="360" w:lineRule="auto"/>
         <w:rPr>
-          <w:rFonts w:ascii="Times" w:hAnsi="Times"/>
-          <w:lang w:eastAsia="zh-TW"/>
-        </w:rPr>
-      </w:pPr>
-      <w:r>
-        <w:rPr>
-          <w:rFonts w:ascii="Times" w:hAnsi="Times" w:hint="eastAsia"/>
-          <w:lang w:eastAsia="zh-TW"/>
-        </w:rPr>
-        <w:t>施政報告扶助置業方向正確</w:t>
-      </w:r>
-      <w:r>
-        <w:rPr>
-          <w:rFonts w:ascii="Times" w:hAnsi="Times"/>
-        </w:rPr>
-        <w:t xml:space="preserve"> </w:t>
-      </w:r>
-      <w:r>
-        <w:rPr>
-          <w:rFonts w:ascii="Times" w:hAnsi="Times" w:hint="eastAsia"/>
-          <w:lang w:eastAsia="zh-TW"/>
-        </w:rPr>
-        <w:t>惜力度不足</w:t>
+          <w:rFonts w:ascii="Times" w:hAnsi="Times" w:hint="eastAsia"/>
+          <w:lang w:eastAsia="zh-TW"/>
+        </w:rPr>
+      </w:pPr>
+      <w:r>
+        <w:rPr>
+          <w:rFonts w:ascii="Times" w:hAnsi="Times" w:hint="eastAsia"/>
+          <w:lang w:eastAsia="zh-TW"/>
+        </w:rPr>
+        <w:t>從上流階梯到階梯斷層</w:t>
+      </w:r>
+      <w:r>
+        <w:rPr>
+          <w:rFonts w:ascii="Times" w:hAnsi="Times"/>
+        </w:rPr>
+        <w:t>——</w:t>
+      </w:r>
+      <w:r>
+        <w:rPr>
+          <w:rFonts w:ascii="Times" w:hAnsi="Times" w:hint="eastAsia"/>
+          <w:lang w:eastAsia="zh-TW"/>
+        </w:rPr>
+        <w:t>香港公營房屋福利的世代差距</w:t>
       </w:r>
       <w:r>
         <w:rPr>
@@ -2979,7 +2889,7 @@
         <w:rPr>
           <w:rFonts w:ascii="Times" w:hAnsi="Times"/>
         </w:rPr>
-        <w:t xml:space="preserve">, 2025-10-2, </w:t>
+        <w:t xml:space="preserve">, 2026-1-29, </w:t>
       </w:r>
       <w:r>
         <w:rPr>
@@ -3004,29 +2914,29 @@
         </w:numPr>
         <w:spacing w:after="120" w:line="360" w:lineRule="auto"/>
         <w:rPr>
-          <w:rFonts w:ascii="Times" w:hAnsi="Times"/>
-          <w:lang w:eastAsia="zh-TW"/>
-        </w:rPr>
-      </w:pPr>
-      <w:r>
-        <w:rPr>
-          <w:rFonts w:ascii="Times" w:hAnsi="Times" w:hint="eastAsia"/>
-          <w:lang w:eastAsia="zh-TW"/>
-        </w:rPr>
-        <w:t>租置杳然未破局</w:t>
-      </w:r>
-      <w:r>
-        <w:rPr>
-          <w:rFonts w:ascii="Times" w:hAnsi="Times"/>
-        </w:rPr>
-        <w:t xml:space="preserve"> </w:t>
-      </w:r>
-      <w:r>
-        <w:rPr>
-          <w:rFonts w:ascii="Times" w:hAnsi="Times" w:hint="eastAsia"/>
-          <w:lang w:eastAsia="zh-TW"/>
-        </w:rPr>
-        <w:t>夾心階層上流難</w:t>
+          <w:rFonts w:ascii="Times" w:hAnsi="Times" w:hint="eastAsia"/>
+          <w:lang w:eastAsia="zh-TW"/>
+        </w:rPr>
+      </w:pPr>
+      <w:r>
+        <w:rPr>
+          <w:rFonts w:ascii="Times" w:hAnsi="Times" w:hint="eastAsia"/>
+          <w:lang w:eastAsia="zh-TW"/>
+        </w:rPr>
+        <w:t>闡釋</w:t>
+      </w:r>
+      <w:r>
+        <w:rPr>
+          <w:rFonts w:ascii="Times" w:hAnsi="Times"/>
+        </w:rPr>
+        <w:t>1985-2023</w:t>
+      </w:r>
+      <w:r>
+        <w:rPr>
+          <w:rFonts w:ascii="Times" w:hAnsi="Times" w:hint="eastAsia"/>
+          <w:lang w:eastAsia="zh-TW"/>
+        </w:rPr>
+        <w:t>年間香港房屋負擔能力與置業動向</w:t>
       </w:r>
       <w:r>
         <w:rPr>
@@ -3039,26 +2949,26 @@
           <w:rFonts w:ascii="Times" w:hAnsi="Times" w:hint="eastAsia"/>
           <w:lang w:eastAsia="zh-TW"/>
         </w:rPr>
-        <w:t>信報</w:t>
-      </w:r>
-      <w:r>
-        <w:rPr>
-          <w:rFonts w:ascii="Times" w:hAnsi="Times"/>
-        </w:rPr>
-        <w:t xml:space="preserve">, 2025-9-18, </w:t>
-      </w:r>
-      <w:r>
-        <w:rPr>
-          <w:rFonts w:ascii="Times" w:hAnsi="Times" w:hint="eastAsia"/>
-          <w:lang w:eastAsia="zh-TW"/>
-        </w:rPr>
-        <w:t>與牛致行和宋恩榮</w:t>
-      </w:r>
-      <w:r>
-        <w:rPr>
-          <w:rFonts w:ascii="Times" w:hAnsi="Times"/>
-        </w:rPr>
-        <w:t xml:space="preserve">) </w:t>
+        <w:t>香港經濟政策綠皮書</w:t>
+      </w:r>
+      <w:r>
+        <w:rPr>
+          <w:rFonts w:ascii="Times" w:hAnsi="Times"/>
+        </w:rPr>
+        <w:t xml:space="preserve">, 2026-1-14, </w:t>
+      </w:r>
+      <w:r>
+        <w:rPr>
+          <w:rFonts w:ascii="Times" w:hAnsi="Times" w:hint="eastAsia"/>
+          <w:lang w:eastAsia="zh-TW"/>
+        </w:rPr>
+        <w:t>與黃唯一和牛致行</w:t>
+      </w:r>
+      <w:r>
+        <w:rPr>
+          <w:rFonts w:ascii="Times" w:hAnsi="Times"/>
+        </w:rPr>
+        <w:t>)</w:t>
       </w:r>
     </w:p>
     <w:p>
@@ -3079,7 +2989,20 @@
           <w:rFonts w:ascii="Times" w:hAnsi="Times" w:hint="eastAsia"/>
           <w:lang w:eastAsia="zh-TW"/>
         </w:rPr>
-        <w:t>房策全面改革——促進置業、重建房屋階梯、鼓勵青年上流</w:t>
+        <w:t>施政報告扶助置業方向正確</w:t>
+      </w:r>
+      <w:r>
+        <w:rPr>
+          <w:rFonts w:ascii="Times" w:hAnsi="Times"/>
+        </w:rPr>
+        <w:t xml:space="preserve"> </w:t>
+      </w:r>
+      <w:r>
+        <w:rPr>
+          <w:rFonts w:ascii="Times" w:hAnsi="Times" w:hint="eastAsia"/>
+          <w:lang w:eastAsia="zh-TW"/>
+        </w:rPr>
+        <w:t>惜力度不足</w:t>
       </w:r>
       <w:r>
         <w:rPr>
@@ -3098,7 +3021,7 @@
         <w:rPr>
           <w:rFonts w:ascii="Times" w:hAnsi="Times"/>
         </w:rPr>
-        <w:t xml:space="preserve">, 2025-9-11, </w:t>
+        <w:t xml:space="preserve">, 2025-10-2, </w:t>
       </w:r>
       <w:r>
         <w:rPr>
@@ -3132,7 +3055,7 @@
           <w:rFonts w:ascii="Times" w:hAnsi="Times" w:hint="eastAsia"/>
           <w:lang w:eastAsia="zh-TW"/>
         </w:rPr>
-        <w:t>公營房屋改革</w:t>
+        <w:t>租置杳然未破局</w:t>
       </w:r>
       <w:r>
         <w:rPr>
@@ -3145,32 +3068,26 @@
           <w:rFonts w:ascii="Times" w:hAnsi="Times" w:hint="eastAsia"/>
           <w:lang w:eastAsia="zh-TW"/>
         </w:rPr>
-        <w:t>會否冲跨私樓市場</w:t>
-      </w:r>
-      <w:r>
-        <w:rPr>
-          <w:rFonts w:ascii="Times" w:hAnsi="Times"/>
-        </w:rPr>
-        <w:t xml:space="preserve"> </w:t>
-      </w:r>
-      <w:r>
-        <w:rPr>
-          <w:rFonts w:ascii="Times" w:hAnsi="Times"/>
-        </w:rPr>
-        <w:t>(</w:t>
-      </w:r>
-      <w:r>
-        <w:rPr>
-          <w:rFonts w:ascii="Times" w:hAnsi="Times" w:hint="eastAsia"/>
-          <w:lang w:eastAsia="zh-TW"/>
-        </w:rPr>
-        <w:t>明報</w:t>
-      </w:r>
-      <w:r>
-        <w:rPr>
-          <w:rFonts w:ascii="Times" w:hAnsi="Times"/>
-        </w:rPr>
-        <w:t xml:space="preserve">, 2025-8-21, </w:t>
+        <w:t>夾心階層上流難</w:t>
+      </w:r>
+      <w:r>
+        <w:rPr>
+          <w:rFonts w:ascii="Times" w:hAnsi="Times"/>
+        </w:rPr>
+        <w:t xml:space="preserve"> (</w:t>
+      </w:r>
+      <w:r>
+        <w:rPr>
+          <w:rFonts w:ascii="Times" w:hAnsi="Times" w:hint="eastAsia"/>
+          <w:lang w:eastAsia="zh-TW"/>
+        </w:rPr>
+        <w:t>信報</w:t>
+      </w:r>
+      <w:r>
+        <w:rPr>
+          <w:rFonts w:ascii="Times" w:hAnsi="Times"/>
+        </w:rPr>
+        <w:t xml:space="preserve">, 2025-9-18, </w:t>
       </w:r>
       <w:r>
         <w:rPr>
@@ -3183,7 +3100,7 @@
         <w:rPr>
           <w:rFonts w:ascii="Times" w:hAnsi="Times"/>
         </w:rPr>
-        <w:t>)</w:t>
+        <w:t xml:space="preserve">) </w:t>
       </w:r>
     </w:p>
     <w:p>
@@ -3204,7 +3121,7 @@
           <w:rFonts w:ascii="Times" w:hAnsi="Times" w:hint="eastAsia"/>
           <w:lang w:eastAsia="zh-TW"/>
         </w:rPr>
-        <w:t>租置計劃：從失敗教訓到全民共享</w:t>
+        <w:t>房策全面改革——促進置業、重建房屋階梯、鼓勵青年上流</w:t>
       </w:r>
       <w:r>
         <w:rPr>
@@ -3223,7 +3140,7 @@
         <w:rPr>
           <w:rFonts w:ascii="Times" w:hAnsi="Times"/>
         </w:rPr>
-        <w:t xml:space="preserve">, 2025-7-31, </w:t>
+        <w:t xml:space="preserve">, 2025-9-11, </w:t>
       </w:r>
       <w:r>
         <w:rPr>
@@ -3257,7 +3174,7 @@
           <w:rFonts w:ascii="Times" w:hAnsi="Times" w:hint="eastAsia"/>
           <w:lang w:eastAsia="zh-TW"/>
         </w:rPr>
-        <w:t>居屋二手市場流通窒息</w:t>
+        <w:t>公營房屋改革</w:t>
       </w:r>
       <w:r>
         <w:rPr>
@@ -3270,13 +3187,19 @@
           <w:rFonts w:ascii="Times" w:hAnsi="Times" w:hint="eastAsia"/>
           <w:lang w:eastAsia="zh-TW"/>
         </w:rPr>
-        <w:t>買賣限制須大幅放寬</w:t>
-      </w:r>
-      <w:r>
-        <w:rPr>
-          <w:rFonts w:ascii="Times" w:hAnsi="Times"/>
-        </w:rPr>
-        <w:t xml:space="preserve"> (</w:t>
+        <w:t>會否冲跨私樓市場</w:t>
+      </w:r>
+      <w:r>
+        <w:rPr>
+          <w:rFonts w:ascii="Times" w:hAnsi="Times"/>
+        </w:rPr>
+        <w:t xml:space="preserve"> </w:t>
+      </w:r>
+      <w:r>
+        <w:rPr>
+          <w:rFonts w:ascii="Times" w:hAnsi="Times"/>
+        </w:rPr>
+        <w:t>(</w:t>
       </w:r>
       <w:r>
         <w:rPr>
@@ -3289,7 +3212,7 @@
         <w:rPr>
           <w:rFonts w:ascii="Times" w:hAnsi="Times"/>
         </w:rPr>
-        <w:t xml:space="preserve">, 2025-7-3, </w:t>
+        <w:t xml:space="preserve">, 2025-8-21, </w:t>
       </w:r>
       <w:r>
         <w:rPr>
@@ -3302,7 +3225,7 @@
         <w:rPr>
           <w:rFonts w:ascii="Times" w:hAnsi="Times"/>
         </w:rPr>
-        <w:t xml:space="preserve">) </w:t>
+        <w:t>)</w:t>
       </w:r>
     </w:p>
     <w:p>
@@ -3323,20 +3246,7 @@
           <w:rFonts w:ascii="Times" w:hAnsi="Times" w:hint="eastAsia"/>
           <w:lang w:eastAsia="zh-TW"/>
         </w:rPr>
-        <w:t>居屋嚴重短缺扭曲社會發展</w:t>
-      </w:r>
-      <w:r>
-        <w:rPr>
-          <w:rFonts w:ascii="Times" w:hAnsi="Times"/>
-        </w:rPr>
-        <w:t xml:space="preserve"> </w:t>
-      </w:r>
-      <w:r>
-        <w:rPr>
-          <w:rFonts w:ascii="Times" w:hAnsi="Times" w:hint="eastAsia"/>
-          <w:lang w:eastAsia="zh-TW"/>
-        </w:rPr>
-        <w:t>需大幅擴建</w:t>
+        <w:t>租置計劃：從失敗教訓到全民共享</w:t>
       </w:r>
       <w:r>
         <w:rPr>
@@ -3355,7 +3265,7 @@
         <w:rPr>
           <w:rFonts w:ascii="Times" w:hAnsi="Times"/>
         </w:rPr>
-        <w:t xml:space="preserve">, 2025-6-27, </w:t>
+        <w:t xml:space="preserve">, 2025-7-31, </w:t>
       </w:r>
       <w:r>
         <w:rPr>
@@ -3389,7 +3299,7 @@
           <w:rFonts w:ascii="Times" w:hAnsi="Times" w:hint="eastAsia"/>
           <w:lang w:eastAsia="zh-TW"/>
         </w:rPr>
-        <w:t>現金津貼試行計劃退場</w:t>
+        <w:t>居屋二手市場流通窒息</w:t>
       </w:r>
       <w:r>
         <w:rPr>
@@ -3402,7 +3312,7 @@
           <w:rFonts w:ascii="Times" w:hAnsi="Times" w:hint="eastAsia"/>
           <w:lang w:eastAsia="zh-TW"/>
         </w:rPr>
-        <w:t>是明智決定——從經濟學理論看補貼轉型的必要性</w:t>
+        <w:t>買賣限制須大幅放寬</w:t>
       </w:r>
       <w:r>
         <w:rPr>
@@ -3421,7 +3331,7 @@
         <w:rPr>
           <w:rFonts w:ascii="Times" w:hAnsi="Times"/>
         </w:rPr>
-        <w:t xml:space="preserve">, 2025-6-5, </w:t>
+        <w:t xml:space="preserve">, 2025-7-3, </w:t>
       </w:r>
       <w:r>
         <w:rPr>
@@ -3455,7 +3365,7 @@
           <w:rFonts w:ascii="Times" w:hAnsi="Times" w:hint="eastAsia"/>
           <w:lang w:eastAsia="zh-TW"/>
         </w:rPr>
-        <w:t>財赤之出路：賣公屋</w:t>
+        <w:t>居屋嚴重短缺扭曲社會發展</w:t>
       </w:r>
       <w:r>
         <w:rPr>
@@ -3468,7 +3378,7 @@
           <w:rFonts w:ascii="Times" w:hAnsi="Times" w:hint="eastAsia"/>
           <w:lang w:eastAsia="zh-TW"/>
         </w:rPr>
-        <w:t>救香港！</w:t>
+        <w:t>需大幅擴建</w:t>
       </w:r>
       <w:r>
         <w:rPr>
@@ -3487,7 +3397,7 @@
         <w:rPr>
           <w:rFonts w:ascii="Times" w:hAnsi="Times"/>
         </w:rPr>
-        <w:t xml:space="preserve">, 2025-4-24, </w:t>
+        <w:t xml:space="preserve">, 2025-6-27, </w:t>
       </w:r>
       <w:r>
         <w:rPr>
@@ -3521,7 +3431,7 @@
           <w:rFonts w:ascii="Times" w:hAnsi="Times" w:hint="eastAsia"/>
           <w:lang w:eastAsia="zh-TW"/>
         </w:rPr>
-        <w:t>香港經濟面臨長期衰退</w:t>
+        <w:t>現金津貼試行計劃退場</w:t>
       </w:r>
       <w:r>
         <w:rPr>
@@ -3534,7 +3444,7 @@
           <w:rFonts w:ascii="Times" w:hAnsi="Times" w:hint="eastAsia"/>
           <w:lang w:eastAsia="zh-TW"/>
         </w:rPr>
-        <w:t>房策須全面改革（下）</w:t>
+        <w:t>是明智決定——從經濟學理論看補貼轉型的必要性</w:t>
       </w:r>
       <w:r>
         <w:rPr>
@@ -3553,7 +3463,7 @@
         <w:rPr>
           <w:rFonts w:ascii="Times" w:hAnsi="Times"/>
         </w:rPr>
-        <w:t xml:space="preserve">, 2025-3-21, </w:t>
+        <w:t xml:space="preserve">, 2025-6-5, </w:t>
       </w:r>
       <w:r>
         <w:rPr>
@@ -3566,7 +3476,7 @@
         <w:rPr>
           <w:rFonts w:ascii="Times" w:hAnsi="Times"/>
         </w:rPr>
-        <w:t>)</w:t>
+        <w:t xml:space="preserve">) </w:t>
       </w:r>
     </w:p>
     <w:p>
@@ -3587,7 +3497,7 @@
           <w:rFonts w:ascii="Times" w:hAnsi="Times" w:hint="eastAsia"/>
           <w:lang w:eastAsia="zh-TW"/>
         </w:rPr>
-        <w:t>香港經濟面臨長期衰退</w:t>
+        <w:t>財赤之出路：賣公屋</w:t>
       </w:r>
       <w:r>
         <w:rPr>
@@ -3600,13 +3510,13 @@
           <w:rFonts w:ascii="Times" w:hAnsi="Times" w:hint="eastAsia"/>
           <w:lang w:eastAsia="zh-TW"/>
         </w:rPr>
-        <w:t>房策須全面改革（上）</w:t>
-      </w:r>
-      <w:r>
-        <w:rPr>
-          <w:rFonts w:ascii="Times" w:hAnsi="Times"/>
-        </w:rPr>
-        <w:t>(</w:t>
+        <w:t>救香港！</w:t>
+      </w:r>
+      <w:r>
+        <w:rPr>
+          <w:rFonts w:ascii="Times" w:hAnsi="Times"/>
+        </w:rPr>
+        <w:t xml:space="preserve"> (</w:t>
       </w:r>
       <w:r>
         <w:rPr>
@@ -3619,7 +3529,7 @@
         <w:rPr>
           <w:rFonts w:ascii="Times" w:hAnsi="Times"/>
         </w:rPr>
-        <w:t xml:space="preserve">, 2025-2-20, </w:t>
+        <w:t xml:space="preserve">, 2025-4-24, </w:t>
       </w:r>
       <w:r>
         <w:rPr>
@@ -3653,7 +3563,20 @@
           <w:rFonts w:ascii="Times" w:hAnsi="Times" w:hint="eastAsia"/>
           <w:lang w:eastAsia="zh-TW"/>
         </w:rPr>
-        <w:t>剖析香港住房危機：演變與對策</w:t>
+        <w:t>香港經濟面臨長期衰退</w:t>
+      </w:r>
+      <w:r>
+        <w:rPr>
+          <w:rFonts w:ascii="Times" w:hAnsi="Times"/>
+        </w:rPr>
+        <w:t xml:space="preserve"> </w:t>
+      </w:r>
+      <w:r>
+        <w:rPr>
+          <w:rFonts w:ascii="Times" w:hAnsi="Times" w:hint="eastAsia"/>
+          <w:lang w:eastAsia="zh-TW"/>
+        </w:rPr>
+        <w:t>房策須全面改革（下）</w:t>
       </w:r>
       <w:r>
         <w:rPr>
@@ -3666,20 +3589,20 @@
           <w:rFonts w:ascii="Times" w:hAnsi="Times" w:hint="eastAsia"/>
           <w:lang w:eastAsia="zh-TW"/>
         </w:rPr>
-        <w:t>香港經濟政策綠皮書</w:t>
-      </w:r>
-      <w:r>
-        <w:rPr>
-          <w:rFonts w:ascii="Times" w:hAnsi="Times"/>
-        </w:rPr>
-        <w:t xml:space="preserve">, 2025-1-9, </w:t>
-      </w:r>
-      <w:r>
-        <w:rPr>
-          <w:rFonts w:ascii="Times" w:hAnsi="Times" w:hint="eastAsia"/>
-          <w:lang w:eastAsia="zh-TW"/>
-        </w:rPr>
-        <w:t>與何漢樑和洪雨林</w:t>
+        <w:t>明報</w:t>
+      </w:r>
+      <w:r>
+        <w:rPr>
+          <w:rFonts w:ascii="Times" w:hAnsi="Times"/>
+        </w:rPr>
+        <w:t xml:space="preserve">, 2025-3-21, </w:t>
+      </w:r>
+      <w:r>
+        <w:rPr>
+          <w:rFonts w:ascii="Times" w:hAnsi="Times" w:hint="eastAsia"/>
+          <w:lang w:eastAsia="zh-TW"/>
+        </w:rPr>
+        <w:t>與牛致行和宋恩榮</w:t>
       </w:r>
       <w:r>
         <w:rPr>
@@ -3706,8 +3629,7 @@
           <w:rFonts w:ascii="Times" w:hAnsi="Times" w:hint="eastAsia"/>
           <w:lang w:eastAsia="zh-TW"/>
         </w:rPr>
-        <w:lastRenderedPageBreak/>
-        <w:t>要告別劏房</w:t>
+        <w:t>香港經濟面臨長期衰退</w:t>
       </w:r>
       <w:r>
         <w:rPr>
@@ -3720,13 +3642,13 @@
           <w:rFonts w:ascii="Times" w:hAnsi="Times" w:hint="eastAsia"/>
           <w:lang w:eastAsia="zh-TW"/>
         </w:rPr>
-        <w:t>絕不能規管起始租金</w:t>
-      </w:r>
-      <w:r>
-        <w:rPr>
-          <w:rFonts w:ascii="Times" w:hAnsi="Times"/>
-        </w:rPr>
-        <w:t xml:space="preserve"> (</w:t>
+        <w:t>房策須全面改革（上）</w:t>
+      </w:r>
+      <w:r>
+        <w:rPr>
+          <w:rFonts w:ascii="Times" w:hAnsi="Times"/>
+        </w:rPr>
+        <w:t>(</w:t>
       </w:r>
       <w:r>
         <w:rPr>
@@ -3739,39 +3661,14 @@
         <w:rPr>
           <w:rFonts w:ascii="Times" w:hAnsi="Times"/>
         </w:rPr>
-        <w:t>, 2024-</w:t>
-      </w:r>
-      <w:r>
-        <w:rPr>
-          <w:rFonts w:ascii="Times" w:hAnsi="Times"/>
-        </w:rPr>
-        <w:t>11</w:t>
-      </w:r>
-      <w:r>
-        <w:rPr>
-          <w:rFonts w:ascii="Times" w:hAnsi="Times"/>
-        </w:rPr>
-        <w:t>-</w:t>
-      </w:r>
-      <w:r>
-        <w:rPr>
-          <w:rFonts w:ascii="Times" w:hAnsi="Times"/>
-        </w:rPr>
-        <w:t>7,</w:t>
-      </w:r>
-      <w:r>
-        <w:rPr>
-          <w:rFonts w:ascii="Times" w:hAnsi="Times" w:hint="eastAsia"/>
-          <w:lang w:eastAsia="zh-TW"/>
-        </w:rPr>
-        <w:t>與</w:t>
-      </w:r>
-      <w:r>
-        <w:rPr>
-          <w:rFonts w:ascii="Times" w:hAnsi="Times" w:hint="eastAsia"/>
-          <w:lang w:eastAsia="zh-TW"/>
-        </w:rPr>
-        <w:t>宋恩榮</w:t>
+        <w:t xml:space="preserve">, 2025-2-20, </w:t>
+      </w:r>
+      <w:r>
+        <w:rPr>
+          <w:rFonts w:ascii="Times" w:hAnsi="Times" w:hint="eastAsia"/>
+          <w:lang w:eastAsia="zh-TW"/>
+        </w:rPr>
+        <w:t>與牛致行和宋恩榮</w:t>
       </w:r>
       <w:r>
         <w:rPr>
@@ -3798,20 +3695,7 @@
           <w:rFonts w:ascii="Times" w:hAnsi="Times" w:hint="eastAsia"/>
           <w:lang w:eastAsia="zh-TW"/>
         </w:rPr>
-        <w:t>住房短缺礙引才</w:t>
-      </w:r>
-      <w:r>
-        <w:rPr>
-          <w:rFonts w:ascii="Times" w:hAnsi="Times"/>
-        </w:rPr>
-        <w:t xml:space="preserve"> </w:t>
-      </w:r>
-      <w:r>
-        <w:rPr>
-          <w:rFonts w:ascii="Times" w:hAnsi="Times" w:hint="eastAsia"/>
-          <w:lang w:eastAsia="zh-TW"/>
-        </w:rPr>
-        <w:t>政府應續增建屋</w:t>
+        <w:t>剖析香港住房危機：演變與對策</w:t>
       </w:r>
       <w:r>
         <w:rPr>
@@ -3824,13 +3708,26 @@
           <w:rFonts w:ascii="Times" w:hAnsi="Times" w:hint="eastAsia"/>
           <w:lang w:eastAsia="zh-TW"/>
         </w:rPr>
-        <w:t>明報</w:t>
-      </w:r>
-      <w:r>
-        <w:rPr>
-          <w:rFonts w:ascii="Times" w:hAnsi="Times"/>
-        </w:rPr>
-        <w:t>, 2024-8-14)</w:t>
+        <w:t>香港經濟政策綠皮書</w:t>
+      </w:r>
+      <w:r>
+        <w:rPr>
+          <w:rFonts w:ascii="Times" w:hAnsi="Times"/>
+        </w:rPr>
+        <w:t xml:space="preserve">, 2025-1-9, </w:t>
+      </w:r>
+      <w:r>
+        <w:rPr>
+          <w:rFonts w:ascii="Times" w:hAnsi="Times" w:hint="eastAsia"/>
+          <w:lang w:eastAsia="zh-TW"/>
+        </w:rPr>
+        <w:t>與何漢樑和洪雨林</w:t>
+      </w:r>
+      <w:r>
+        <w:rPr>
+          <w:rFonts w:ascii="Times" w:hAnsi="Times"/>
+        </w:rPr>
+        <w:t>)</w:t>
       </w:r>
     </w:p>
     <w:p>
@@ -3843,14 +3740,16 @@
         <w:spacing w:after="120" w:line="360" w:lineRule="auto"/>
         <w:rPr>
           <w:rFonts w:ascii="Times" w:hAnsi="Times"/>
-        </w:rPr>
-      </w:pPr>
-      <w:r>
-        <w:rPr>
-          <w:rFonts w:ascii="Times" w:hAnsi="Times" w:hint="eastAsia"/>
-          <w:lang w:eastAsia="zh-TW"/>
-        </w:rPr>
-        <w:t>加強富戶審查</w:t>
+          <w:lang w:eastAsia="zh-TW"/>
+        </w:rPr>
+      </w:pPr>
+      <w:r>
+        <w:rPr>
+          <w:rFonts w:ascii="Times" w:hAnsi="Times" w:hint="eastAsia"/>
+          <w:lang w:eastAsia="zh-TW"/>
+        </w:rPr>
+        <w:lastRenderedPageBreak/>
+        <w:t>要告別劏房</w:t>
       </w:r>
       <w:r>
         <w:rPr>
@@ -3863,42 +3762,59 @@
           <w:rFonts w:ascii="Times" w:hAnsi="Times" w:hint="eastAsia"/>
           <w:lang w:eastAsia="zh-TW"/>
         </w:rPr>
-        <w:t>劏房戶免受苦？</w:t>
-      </w:r>
-      <w:r>
-        <w:rPr>
-          <w:rFonts w:ascii="Times" w:hAnsi="Times"/>
-        </w:rPr>
-        <w:t xml:space="preserve"> </w:t>
-      </w:r>
-      <w:r>
-        <w:rPr>
-          <w:rFonts w:ascii="Times" w:hAnsi="Times"/>
-        </w:rPr>
-        <w:t>(</w:t>
-      </w:r>
-      <w:proofErr w:type="spellStart"/>
-      <w:r>
-        <w:rPr>
-          <w:rFonts w:ascii="Times" w:hAnsi="Times" w:hint="eastAsia"/>
+        <w:t>絕不能規管起始租金</w:t>
+      </w:r>
+      <w:r>
+        <w:rPr>
+          <w:rFonts w:ascii="Times" w:hAnsi="Times"/>
+        </w:rPr>
+        <w:t xml:space="preserve"> (</w:t>
+      </w:r>
+      <w:r>
+        <w:rPr>
+          <w:rFonts w:ascii="Times" w:hAnsi="Times" w:hint="eastAsia"/>
+          <w:lang w:eastAsia="zh-TW"/>
         </w:rPr>
         <w:t>明報</w:t>
       </w:r>
-      <w:proofErr w:type="spellEnd"/>
-      <w:r>
-        <w:rPr>
-          <w:rFonts w:ascii="Times" w:hAnsi="Times"/>
-        </w:rPr>
-        <w:t xml:space="preserve">, 2024-5-16, </w:t>
-      </w:r>
-      <w:proofErr w:type="spellStart"/>
-      <w:r>
-        <w:rPr>
-          <w:rFonts w:ascii="Times" w:hAnsi="Times" w:hint="eastAsia"/>
-        </w:rPr>
-        <w:t>與何漢樑</w:t>
-      </w:r>
-      <w:proofErr w:type="spellEnd"/>
+      <w:r>
+        <w:rPr>
+          <w:rFonts w:ascii="Times" w:hAnsi="Times"/>
+        </w:rPr>
+        <w:t>, 2024-</w:t>
+      </w:r>
+      <w:r>
+        <w:rPr>
+          <w:rFonts w:ascii="Times" w:hAnsi="Times"/>
+        </w:rPr>
+        <w:t>11</w:t>
+      </w:r>
+      <w:r>
+        <w:rPr>
+          <w:rFonts w:ascii="Times" w:hAnsi="Times"/>
+        </w:rPr>
+        <w:t>-</w:t>
+      </w:r>
+      <w:r>
+        <w:rPr>
+          <w:rFonts w:ascii="Times" w:hAnsi="Times"/>
+        </w:rPr>
+        <w:t>7,</w:t>
+      </w:r>
+      <w:r>
+        <w:rPr>
+          <w:rFonts w:ascii="Times" w:hAnsi="Times" w:hint="eastAsia"/>
+          <w:lang w:eastAsia="zh-TW"/>
+        </w:rPr>
+        <w:t>與</w:t>
+      </w:r>
+      <w:r>
+        <w:rPr>
+          <w:rFonts w:ascii="Times" w:hAnsi="Times" w:hint="eastAsia"/>
+          <w:lang w:eastAsia="zh-TW"/>
+        </w:rPr>
+        <w:t>宋恩榮</w:t>
+      </w:r>
       <w:r>
         <w:rPr>
           <w:rFonts w:ascii="Times" w:hAnsi="Times"/>
@@ -3924,7 +3840,20 @@
           <w:rFonts w:ascii="Times" w:hAnsi="Times" w:hint="eastAsia"/>
           <w:lang w:eastAsia="zh-TW"/>
         </w:rPr>
-        <w:t>香港劏房問題之出路</w:t>
+        <w:t>住房短缺礙引才</w:t>
+      </w:r>
+      <w:r>
+        <w:rPr>
+          <w:rFonts w:ascii="Times" w:hAnsi="Times"/>
+        </w:rPr>
+        <w:t xml:space="preserve"> </w:t>
+      </w:r>
+      <w:r>
+        <w:rPr>
+          <w:rFonts w:ascii="Times" w:hAnsi="Times" w:hint="eastAsia"/>
+          <w:lang w:eastAsia="zh-TW"/>
+        </w:rPr>
+        <w:t>政府應續增建屋</w:t>
       </w:r>
       <w:r>
         <w:rPr>
@@ -3937,13 +3866,13 @@
           <w:rFonts w:ascii="Times" w:hAnsi="Times" w:hint="eastAsia"/>
           <w:lang w:eastAsia="zh-TW"/>
         </w:rPr>
-        <w:t>香港信報</w:t>
-      </w:r>
-      <w:r>
-        <w:rPr>
-          <w:rFonts w:ascii="Times" w:hAnsi="Times"/>
-        </w:rPr>
-        <w:t>, 2024-2-14)</w:t>
+        <w:t>明報</w:t>
+      </w:r>
+      <w:r>
+        <w:rPr>
+          <w:rFonts w:ascii="Times" w:hAnsi="Times"/>
+        </w:rPr>
+        <w:t>, 2024-8-14)</w:t>
       </w:r>
     </w:p>
     <w:p>
@@ -3956,42 +3885,62 @@
         <w:spacing w:after="120" w:line="360" w:lineRule="auto"/>
         <w:rPr>
           <w:rFonts w:ascii="Times" w:hAnsi="Times"/>
-          <w:lang w:eastAsia="zh-TW"/>
-        </w:rPr>
-      </w:pPr>
-      <w:r>
-        <w:rPr>
-          <w:rFonts w:ascii="Times" w:hAnsi="Times" w:hint="eastAsia"/>
-          <w:lang w:eastAsia="zh-TW"/>
-        </w:rPr>
-        <w:t>人才得失與香港前景：領英社交資料佐證</w:t>
-      </w:r>
-      <w:r>
-        <w:rPr>
-          <w:rFonts w:ascii="Times" w:hAnsi="Times"/>
-        </w:rPr>
-        <w:t xml:space="preserve"> (</w:t>
-      </w:r>
-      <w:r>
-        <w:rPr>
-          <w:rFonts w:ascii="Times" w:hAnsi="Times" w:hint="eastAsia"/>
-          <w:lang w:eastAsia="zh-TW"/>
-        </w:rPr>
-        <w:t>香港經濟政策綠皮書</w:t>
-      </w:r>
-      <w:r>
-        <w:rPr>
-          <w:rFonts w:ascii="Times" w:hAnsi="Times"/>
-        </w:rPr>
-        <w:t xml:space="preserve">, 2024-1-10, </w:t>
-      </w:r>
-      <w:r>
-        <w:rPr>
-          <w:rFonts w:ascii="Times" w:hAnsi="Times" w:hint="eastAsia"/>
-          <w:lang w:eastAsia="zh-TW"/>
-        </w:rPr>
-        <w:t>與關穎倫和鄧希煒</w:t>
-      </w:r>
+        </w:rPr>
+      </w:pPr>
+      <w:r>
+        <w:rPr>
+          <w:rFonts w:ascii="Times" w:hAnsi="Times" w:hint="eastAsia"/>
+          <w:lang w:eastAsia="zh-TW"/>
+        </w:rPr>
+        <w:t>加強富戶審查</w:t>
+      </w:r>
+      <w:r>
+        <w:rPr>
+          <w:rFonts w:ascii="Times" w:hAnsi="Times"/>
+        </w:rPr>
+        <w:t xml:space="preserve"> </w:t>
+      </w:r>
+      <w:r>
+        <w:rPr>
+          <w:rFonts w:ascii="Times" w:hAnsi="Times" w:hint="eastAsia"/>
+          <w:lang w:eastAsia="zh-TW"/>
+        </w:rPr>
+        <w:t>劏房戶免受苦？</w:t>
+      </w:r>
+      <w:r>
+        <w:rPr>
+          <w:rFonts w:ascii="Times" w:hAnsi="Times"/>
+        </w:rPr>
+        <w:t xml:space="preserve"> </w:t>
+      </w:r>
+      <w:r>
+        <w:rPr>
+          <w:rFonts w:ascii="Times" w:hAnsi="Times"/>
+        </w:rPr>
+        <w:t>(</w:t>
+      </w:r>
+      <w:proofErr w:type="spellStart"/>
+      <w:r>
+        <w:rPr>
+          <w:rFonts w:ascii="Times" w:hAnsi="Times" w:hint="eastAsia"/>
+        </w:rPr>
+        <w:t>明報</w:t>
+      </w:r>
+      <w:proofErr w:type="spellEnd"/>
+      <w:r>
+        <w:rPr>
+          <w:rFonts w:ascii="Times" w:hAnsi="Times"/>
+        </w:rPr>
+        <w:t xml:space="preserve">, 2024-5-16, </w:t>
+      </w:r>
+      <w:proofErr w:type="spellStart"/>
+      <w:r>
+        <w:rPr>
+          <w:rFonts w:ascii="Times" w:hAnsi="Times" w:hint="eastAsia"/>
+        </w:rPr>
+        <w:t>與何漢樑</w:t>
+      </w:r>
+      <w:proofErr w:type="spellEnd"/>
       <w:r>
         <w:rPr>
           <w:rFonts w:ascii="Times" w:hAnsi="Times"/>
@@ -4017,7 +3966,7 @@
           <w:rFonts w:ascii="Times" w:hAnsi="Times" w:hint="eastAsia"/>
           <w:lang w:eastAsia="zh-TW"/>
         </w:rPr>
-        <w:t>利用數據和算法減低公屋輪候時間</w:t>
+        <w:t>香港劏房問題之出路</w:t>
       </w:r>
       <w:r>
         <w:rPr>
@@ -4030,26 +3979,13 @@
           <w:rFonts w:ascii="Times" w:hAnsi="Times" w:hint="eastAsia"/>
           <w:lang w:eastAsia="zh-TW"/>
         </w:rPr>
-        <w:t>香港經濟政策綠皮書</w:t>
-      </w:r>
-      <w:r>
-        <w:rPr>
-          <w:rFonts w:ascii="Times" w:hAnsi="Times"/>
-        </w:rPr>
-        <w:t xml:space="preserve">, 2024-1-10, </w:t>
-      </w:r>
-      <w:r>
-        <w:rPr>
-          <w:rFonts w:ascii="Times" w:hAnsi="Times" w:hint="eastAsia"/>
-          <w:lang w:eastAsia="zh-TW"/>
-        </w:rPr>
-        <w:t>與王欣儀和黃美施</w:t>
-      </w:r>
-      <w:r>
-        <w:rPr>
-          <w:rFonts w:ascii="Times" w:hAnsi="Times"/>
-        </w:rPr>
-        <w:t>)</w:t>
+        <w:t>香港信報</w:t>
+      </w:r>
+      <w:r>
+        <w:rPr>
+          <w:rFonts w:ascii="Times" w:hAnsi="Times"/>
+        </w:rPr>
+        <w:t>, 2024-2-14)</w:t>
       </w:r>
     </w:p>
     <w:p>
@@ -4070,7 +4006,7 @@
           <w:rFonts w:ascii="Times" w:hAnsi="Times" w:hint="eastAsia"/>
           <w:lang w:eastAsia="zh-TW"/>
         </w:rPr>
-        <w:t>香港房屋危機之謎</w:t>
+        <w:t>人才得失與香港前景：領英社交資料佐證</w:t>
       </w:r>
       <w:r>
         <w:rPr>
@@ -4089,7 +4025,20 @@
         <w:rPr>
           <w:rFonts w:ascii="Times" w:hAnsi="Times"/>
         </w:rPr>
-        <w:t>, 2022-9-23)</w:t>
+        <w:t xml:space="preserve">, 2024-1-10, </w:t>
+      </w:r>
+      <w:r>
+        <w:rPr>
+          <w:rFonts w:ascii="Times" w:hAnsi="Times" w:hint="eastAsia"/>
+          <w:lang w:eastAsia="zh-TW"/>
+        </w:rPr>
+        <w:t>與關穎倫和鄧希煒</w:t>
+      </w:r>
+      <w:r>
+        <w:rPr>
+          <w:rFonts w:ascii="Times" w:hAnsi="Times"/>
+        </w:rPr>
+        <w:t>)</w:t>
       </w:r>
     </w:p>
     <w:p>
@@ -4110,33 +4059,7 @@
           <w:rFonts w:ascii="Times" w:hAnsi="Times" w:hint="eastAsia"/>
           <w:lang w:eastAsia="zh-TW"/>
         </w:rPr>
-        <w:t>預算案</w:t>
-      </w:r>
-      <w:r>
-        <w:rPr>
-          <w:rFonts w:ascii="Times" w:hAnsi="Times"/>
-        </w:rPr>
-        <w:t>500</w:t>
-      </w:r>
-      <w:r>
-        <w:rPr>
-          <w:rFonts w:ascii="Times" w:hAnsi="Times" w:hint="eastAsia"/>
-          <w:lang w:eastAsia="zh-TW"/>
-        </w:rPr>
-        <w:t>億推創科</w:t>
-      </w:r>
-      <w:r>
-        <w:rPr>
-          <w:rFonts w:ascii="Times" w:hAnsi="Times"/>
-        </w:rPr>
-        <w:t xml:space="preserve"> </w:t>
-      </w:r>
-      <w:r>
-        <w:rPr>
-          <w:rFonts w:ascii="Times" w:hAnsi="Times" w:hint="eastAsia"/>
-          <w:lang w:eastAsia="zh-TW"/>
-        </w:rPr>
-        <w:t>怎用得其所</w:t>
+        <w:t>利用數據和算法減低公屋輪候時間</w:t>
       </w:r>
       <w:r>
         <w:rPr>
@@ -4149,13 +4072,26 @@
           <w:rFonts w:ascii="Times" w:hAnsi="Times" w:hint="eastAsia"/>
           <w:lang w:eastAsia="zh-TW"/>
         </w:rPr>
-        <w:t>香港經濟日報</w:t>
-      </w:r>
-      <w:r>
-        <w:rPr>
-          <w:rFonts w:ascii="Times" w:hAnsi="Times"/>
-        </w:rPr>
-        <w:t>, 2018-3-18)</w:t>
+        <w:t>香港經濟政策綠皮書</w:t>
+      </w:r>
+      <w:r>
+        <w:rPr>
+          <w:rFonts w:ascii="Times" w:hAnsi="Times"/>
+        </w:rPr>
+        <w:t xml:space="preserve">, 2024-1-10, </w:t>
+      </w:r>
+      <w:r>
+        <w:rPr>
+          <w:rFonts w:ascii="Times" w:hAnsi="Times" w:hint="eastAsia"/>
+          <w:lang w:eastAsia="zh-TW"/>
+        </w:rPr>
+        <w:t>與王欣儀和黃美施</w:t>
+      </w:r>
+      <w:r>
+        <w:rPr>
+          <w:rFonts w:ascii="Times" w:hAnsi="Times"/>
+        </w:rPr>
+        <w:t>)</w:t>
       </w:r>
     </w:p>
     <w:p>
@@ -4168,6 +4104,112 @@
         <w:spacing w:after="120" w:line="360" w:lineRule="auto"/>
         <w:rPr>
           <w:rFonts w:ascii="Times" w:hAnsi="Times"/>
+          <w:lang w:eastAsia="zh-TW"/>
+        </w:rPr>
+      </w:pPr>
+      <w:r>
+        <w:rPr>
+          <w:rFonts w:ascii="Times" w:hAnsi="Times" w:hint="eastAsia"/>
+          <w:lang w:eastAsia="zh-TW"/>
+        </w:rPr>
+        <w:t>香港房屋危機之謎</w:t>
+      </w:r>
+      <w:r>
+        <w:rPr>
+          <w:rFonts w:ascii="Times" w:hAnsi="Times"/>
+        </w:rPr>
+        <w:t xml:space="preserve"> (</w:t>
+      </w:r>
+      <w:r>
+        <w:rPr>
+          <w:rFonts w:ascii="Times" w:hAnsi="Times" w:hint="eastAsia"/>
+          <w:lang w:eastAsia="zh-TW"/>
+        </w:rPr>
+        <w:t>香港經濟政策綠皮書</w:t>
+      </w:r>
+      <w:r>
+        <w:rPr>
+          <w:rFonts w:ascii="Times" w:hAnsi="Times"/>
+        </w:rPr>
+        <w:t>, 2022-9-23)</w:t>
+      </w:r>
+    </w:p>
+    <w:p>
+      <w:pPr>
+        <w:pStyle w:val="ListParagraph"/>
+        <w:numPr>
+          <w:ilvl w:val="0"/>
+          <w:numId w:val="1"/>
+        </w:numPr>
+        <w:spacing w:after="120" w:line="360" w:lineRule="auto"/>
+        <w:rPr>
+          <w:rFonts w:ascii="Times" w:hAnsi="Times"/>
+          <w:lang w:eastAsia="zh-TW"/>
+        </w:rPr>
+      </w:pPr>
+      <w:r>
+        <w:rPr>
+          <w:rFonts w:ascii="Times" w:hAnsi="Times" w:hint="eastAsia"/>
+          <w:lang w:eastAsia="zh-TW"/>
+        </w:rPr>
+        <w:t>預算案</w:t>
+      </w:r>
+      <w:r>
+        <w:rPr>
+          <w:rFonts w:ascii="Times" w:hAnsi="Times"/>
+        </w:rPr>
+        <w:t>500</w:t>
+      </w:r>
+      <w:r>
+        <w:rPr>
+          <w:rFonts w:ascii="Times" w:hAnsi="Times" w:hint="eastAsia"/>
+          <w:lang w:eastAsia="zh-TW"/>
+        </w:rPr>
+        <w:t>億推創科</w:t>
+      </w:r>
+      <w:r>
+        <w:rPr>
+          <w:rFonts w:ascii="Times" w:hAnsi="Times"/>
+        </w:rPr>
+        <w:t xml:space="preserve"> </w:t>
+      </w:r>
+      <w:r>
+        <w:rPr>
+          <w:rFonts w:ascii="Times" w:hAnsi="Times" w:hint="eastAsia"/>
+          <w:lang w:eastAsia="zh-TW"/>
+        </w:rPr>
+        <w:t>怎用得其所</w:t>
+      </w:r>
+      <w:r>
+        <w:rPr>
+          <w:rFonts w:ascii="Times" w:hAnsi="Times"/>
+        </w:rPr>
+        <w:t xml:space="preserve"> (</w:t>
+      </w:r>
+      <w:r>
+        <w:rPr>
+          <w:rFonts w:ascii="Times" w:hAnsi="Times" w:hint="eastAsia"/>
+          <w:lang w:eastAsia="zh-TW"/>
+        </w:rPr>
+        <w:t>香港經濟日報</w:t>
+      </w:r>
+      <w:r>
+        <w:rPr>
+          <w:rFonts w:ascii="Times" w:hAnsi="Times"/>
+        </w:rPr>
+        <w:t>, 2018-3-18)</w:t>
+      </w:r>
+    </w:p>
+    <w:p>
+      <w:pPr>
+        <w:pStyle w:val="ListParagraph"/>
+        <w:numPr>
+          <w:ilvl w:val="0"/>
+          <w:numId w:val="1"/>
+        </w:numPr>
+        <w:spacing w:after="120" w:line="360" w:lineRule="auto"/>
+        <w:rPr>
+          <w:rFonts w:ascii="Times" w:hAnsi="Times"/>
           <w:u w:val="single"/>
           <w:lang w:eastAsia="zh-TW"/>
         </w:rPr>
@@ -5721,6 +5763,7 @@
           <w:b/>
           <w:bCs/>
         </w:rPr>
+        <w:pageBreakBefore/>
       </w:pPr>
       <w:r>
         <w:rPr>

</xml_diff>

<commit_message>
Add HKFEI article: 跨越初創「死亡谷」 (2026-10-22)
</commit_message>
<xml_diff>
--- a/static/CV.docx
+++ b/static/CV.docx
@@ -2425,6 +2425,27 @@
           <w:bCs/>
         </w:rPr>
         <w:t>CHINESE)</w:t>
+      </w:r>
+    </w:p>
+    <w:p>
+      <w:pPr>
+        <w:pStyle w:val="ListParagraph"/>
+        <w:numPr>
+          <w:ilvl w:val="0"/>
+          <w:numId w:val="1"/>
+        </w:numPr>
+        <w:spacing w:after="120" w:line="360" w:lineRule="auto"/>
+        <w:rPr>
+          <w:rFonts w:ascii="Times" w:hAnsi="Times"/>
+          <w:lang w:eastAsia="zh-TW"/>
+        </w:rPr>
+      </w:pPr>
+      <w:r>
+        <w:rPr>
+          <w:rFonts w:ascii="Times" w:hAnsi="Times" w:hint="eastAsia"/>
+          <w:lang w:eastAsia="zh-TW"/>
+        </w:rPr>
+        <w:t xml:space="preserve">跨越初創「死亡谷」是香港經濟轉型的關鍵一環 (明報, 2026-10-22, 與譚乃廉和牛致行)</w:t>
       </w:r>
     </w:p>
     <w:p>

</xml_diff>